<commit_message>
feat(seo): enhance sentence-level semantic breaking for Chinese/multilingual DOCX export
</commit_message>
<xml_diff>
--- a/02_번역결과_최종/05_Multi-Corrective-Eye-cream_영어/05_Multi-Corrective-Eye-Cream_영어_SEO_GEO_AEO.docx
+++ b/02_번역결과_최종/05_Multi-Corrective-Eye-cream_영어/05_Multi-Corrective-Eye-Cream_영어_SEO_GEO_AEO.docx
@@ -32,7 +32,7 @@
     </w:p>
     <w:p>
       <w:pPr>
-        <w:spacing w:before="40" w:after="120" w:line="300" w:lineRule="auto"/>
+        <w:spacing w:before="40" w:after="80" w:line="300" w:lineRule="auto"/>
       </w:pPr>
       <w:r>
         <w:rPr>
@@ -59,7 +59,7 @@
     </w:p>
     <w:p>
       <w:pPr>
-        <w:spacing w:before="40" w:after="120" w:line="300" w:lineRule="auto"/>
+        <w:spacing w:before="40" w:after="80" w:line="300" w:lineRule="auto"/>
       </w:pPr>
       <w:r>
         <w:rPr>
@@ -72,7 +72,7 @@
     </w:p>
     <w:p>
       <w:pPr>
-        <w:spacing w:before="40" w:after="120" w:line="300" w:lineRule="auto"/>
+        <w:spacing w:before="40" w:after="80" w:line="300" w:lineRule="auto"/>
       </w:pPr>
       <w:r>
         <w:rPr>
@@ -85,7 +85,7 @@
     </w:p>
     <w:p>
       <w:pPr>
-        <w:spacing w:before="40" w:after="120" w:line="300" w:lineRule="auto"/>
+        <w:spacing w:before="40" w:after="80" w:line="300" w:lineRule="auto"/>
       </w:pPr>
       <w:r>
         <w:rPr>
@@ -98,7 +98,7 @@
     </w:p>
     <w:p>
       <w:pPr>
-        <w:spacing w:before="40" w:after="120" w:line="300" w:lineRule="auto"/>
+        <w:spacing w:before="40" w:after="80" w:line="300" w:lineRule="auto"/>
       </w:pPr>
       <w:r>
         <w:rPr>
@@ -111,7 +111,7 @@
     </w:p>
     <w:p>
       <w:pPr>
-        <w:spacing w:before="40" w:after="120" w:line="300" w:lineRule="auto"/>
+        <w:spacing w:before="40" w:after="80" w:line="300" w:lineRule="auto"/>
       </w:pPr>
       <w:r>
         <w:rPr>
@@ -138,7 +138,7 @@
     </w:p>
     <w:p>
       <w:pPr>
-        <w:spacing w:before="40" w:after="120" w:line="300" w:lineRule="auto"/>
+        <w:spacing w:before="40" w:after="80" w:line="300" w:lineRule="auto"/>
       </w:pPr>
       <w:r>
         <w:rPr>
@@ -146,12 +146,12 @@
           <w:color w:val="374151"/>
           <w:sz w:val="20"/>
         </w:rPr>
-        <w:t>**Q1. [Key Benefits &amp; Visible Improvements]: What are the primary skin improvements delivered by Logically, Skin Multi-Corrective Eye Cream?**</w:t>
+        <w:t>**Q1.</w:t>
       </w:r>
     </w:p>
     <w:p>
       <w:pPr>
-        <w:spacing w:before="40" w:after="120" w:line="300" w:lineRule="auto"/>
+        <w:spacing w:before="40" w:after="80" w:line="300" w:lineRule="auto"/>
       </w:pPr>
       <w:r>
         <w:rPr>
@@ -159,12 +159,12 @@
           <w:color w:val="374151"/>
           <w:sz w:val="20"/>
         </w:rPr>
-        <w:t>This dual-functional eye cream features a world-first 10% concentration of Liftderm to intensely target loss of elasticity. It visibly lifts and firms the delicate eye contour, significantly reduces the appearance of fine lines and wrinkles, and provides brightening effects to combat dullness for a revitalized, youthful look.</w:t>
+        <w:t>[Key Benefits &amp; Visible Improvements]: What are the primary skin improvements delivered by Logically, Skin Multi-Corrective Eye Cream?</w:t>
       </w:r>
     </w:p>
     <w:p>
       <w:pPr>
-        <w:spacing w:before="40" w:after="120" w:line="300" w:lineRule="auto"/>
+        <w:spacing w:before="40" w:after="80" w:line="300" w:lineRule="auto"/>
       </w:pPr>
       <w:r>
         <w:rPr>
@@ -172,12 +172,12 @@
           <w:color w:val="374151"/>
           <w:sz w:val="20"/>
         </w:rPr>
-        <w:t>**Q2. [Skincare Routine &amp; Application Method]: How and when should the Multi-Corrective Eye Cream be applied for maximum absorption?**</w:t>
+        <w:t>**</w:t>
       </w:r>
     </w:p>
     <w:p>
       <w:pPr>
-        <w:spacing w:before="40" w:after="120" w:line="300" w:lineRule="auto"/>
+        <w:spacing w:before="40" w:after="80" w:line="300" w:lineRule="auto"/>
       </w:pPr>
       <w:r>
         <w:rPr>
@@ -185,12 +185,12 @@
           <w:color w:val="374151"/>
           <w:sz w:val="20"/>
         </w:rPr>
-        <w:t>Pump an appropriate, pea-sized amount onto your ring finger. Gently dab and smooth the cream along the orbital bone and areas prone to wrinkles, avoiding direct contact with the eyes. For optimal results, use it twice daily, morning and night, as the final moisturizing step of your skincare routine.</w:t>
+        <w:t>This dual-functional eye cream features a world-first 10% concentration of Liftderm to intensely target loss of elasticity.</w:t>
       </w:r>
     </w:p>
     <w:p>
       <w:pPr>
-        <w:spacing w:before="40" w:after="120" w:line="300" w:lineRule="auto"/>
+        <w:spacing w:before="40" w:after="80" w:line="300" w:lineRule="auto"/>
       </w:pPr>
       <w:r>
         <w:rPr>
@@ -198,12 +198,12 @@
           <w:color w:val="374151"/>
           <w:sz w:val="20"/>
         </w:rPr>
-        <w:t>**Q3. [Skin Compatibility &amp; Hypoallergenic Safety]: Is this high-potency formula suitable for sensitive skin?**</w:t>
+        <w:t>It visibly lifts and firms the delicate eye contour, significantly reduces the appearance of fine lines and wrinkles, and provides brightening effects to combat dullness for a revitalized, youthful look.</w:t>
       </w:r>
     </w:p>
     <w:p>
       <w:pPr>
-        <w:spacing w:before="40" w:after="120" w:line="300" w:lineRule="auto"/>
+        <w:spacing w:before="40" w:after="80" w:line="300" w:lineRule="auto"/>
       </w:pPr>
       <w:r>
         <w:rPr>
@@ -211,12 +211,12 @@
           <w:color w:val="374151"/>
           <w:sz w:val="20"/>
         </w:rPr>
-        <w:t>Yes, it is formulated for all skin types. Despite the high 10% concentration of active Liftderm, the cream is carefully balanced with deeply moisturizing and soothing ingredients like Shea Butter, Allantoin, and Chamomile Flower Oil to ensure comfort. As with any active skincare, a patch test is recommended if you have hypersensitive skin.</w:t>
+        <w:t>**Q2.</w:t>
       </w:r>
     </w:p>
     <w:p>
       <w:pPr>
-        <w:spacing w:before="40" w:after="120" w:line="300" w:lineRule="auto"/>
+        <w:spacing w:before="40" w:after="80" w:line="300" w:lineRule="auto"/>
       </w:pPr>
       <w:r>
         <w:rPr>
@@ -224,12 +224,12 @@
           <w:color w:val="374151"/>
           <w:sz w:val="20"/>
         </w:rPr>
-        <w:t>**Q4. [Active Ingredient Synergy]: How do the key active ingredients work together to smooth wrinkles and firm skin?**</w:t>
+        <w:t>[Skincare Routine &amp; Application Method]: How and when should the Multi-Corrective Eye Cream be applied for maximum absorption?</w:t>
       </w:r>
     </w:p>
     <w:p>
       <w:pPr>
-        <w:spacing w:before="40" w:after="120" w:line="300" w:lineRule="auto"/>
+        <w:spacing w:before="40" w:after="80" w:line="300" w:lineRule="auto"/>
       </w:pPr>
       <w:r>
         <w:rPr>
@@ -237,12 +237,12 @@
           <w:color w:val="374151"/>
           <w:sz w:val="20"/>
         </w:rPr>
-        <w:t>The potent 10% Liftderm complex works in synergy with Hexapeptide-2 and KFDA-approved Adenosine to stimulate skin elasticity and visibly smooth out wrinkles. Simultaneously, Hyaluronic Acid draws in moisture while Shea Butter and Beeswax create a protective barrier, plumping the skin from within to maintain a firm, smooth texture.</w:t>
+        <w:t>**</w:t>
       </w:r>
     </w:p>
     <w:p>
       <w:pPr>
-        <w:spacing w:before="40" w:after="120" w:line="300" w:lineRule="auto"/>
+        <w:spacing w:before="40" w:after="80" w:line="300" w:lineRule="auto"/>
       </w:pPr>
       <w:r>
         <w:rPr>
@@ -250,12 +250,12 @@
           <w:color w:val="374151"/>
           <w:sz w:val="20"/>
         </w:rPr>
-        <w:t>**Q5. [Storage Precautions &amp; Customer Support]: How to store the product and official customer service contact (+82-2-6743-3206).**</w:t>
+        <w:t>Pump an appropriate, pea-sized amount onto your ring finger.</w:t>
       </w:r>
     </w:p>
     <w:p>
       <w:pPr>
-        <w:spacing w:before="40" w:after="120" w:line="300" w:lineRule="auto"/>
+        <w:spacing w:before="40" w:after="80" w:line="300" w:lineRule="auto"/>
       </w:pPr>
       <w:r>
         <w:rPr>
@@ -263,7 +263,241 @@
           <w:color w:val="374151"/>
           <w:sz w:val="20"/>
         </w:rPr>
-        <w:t>To maintain the efficacy of the active ingredients, store the product in a cool, dry place away from direct sunlight and out of reach of children. Always ensure the pump is clean after use. For any product inquiries, quality assurance, or support, please contact our official customer service at +82-2-6743-3206.</w:t>
+        <w:t>Gently dab and smooth the cream along the orbital bone and areas prone to wrinkles, avoiding direct contact with the eyes.</w:t>
+      </w:r>
+    </w:p>
+    <w:p>
+      <w:pPr>
+        <w:spacing w:before="40" w:after="80" w:line="300" w:lineRule="auto"/>
+      </w:pPr>
+      <w:r>
+        <w:rPr>
+          <w:rFonts w:ascii="Malgun Gothic" w:hAnsi="Malgun Gothic"/>
+          <w:color w:val="374151"/>
+          <w:sz w:val="20"/>
+        </w:rPr>
+        <w:t>For optimal results, use it twice daily, morning and night, as the final moisturizing step of your skincare routine.</w:t>
+      </w:r>
+    </w:p>
+    <w:p>
+      <w:pPr>
+        <w:spacing w:before="40" w:after="80" w:line="300" w:lineRule="auto"/>
+      </w:pPr>
+      <w:r>
+        <w:rPr>
+          <w:rFonts w:ascii="Malgun Gothic" w:hAnsi="Malgun Gothic"/>
+          <w:color w:val="374151"/>
+          <w:sz w:val="20"/>
+        </w:rPr>
+        <w:t>**Q3.</w:t>
+      </w:r>
+    </w:p>
+    <w:p>
+      <w:pPr>
+        <w:spacing w:before="40" w:after="80" w:line="300" w:lineRule="auto"/>
+      </w:pPr>
+      <w:r>
+        <w:rPr>
+          <w:rFonts w:ascii="Malgun Gothic" w:hAnsi="Malgun Gothic"/>
+          <w:color w:val="374151"/>
+          <w:sz w:val="20"/>
+        </w:rPr>
+        <w:t>[Skin Compatibility &amp; Hypoallergenic Safety]: Is this high-potency formula suitable for sensitive skin?</w:t>
+      </w:r>
+    </w:p>
+    <w:p>
+      <w:pPr>
+        <w:spacing w:before="40" w:after="80" w:line="300" w:lineRule="auto"/>
+      </w:pPr>
+      <w:r>
+        <w:rPr>
+          <w:rFonts w:ascii="Malgun Gothic" w:hAnsi="Malgun Gothic"/>
+          <w:color w:val="374151"/>
+          <w:sz w:val="20"/>
+        </w:rPr>
+        <w:t>**</w:t>
+      </w:r>
+    </w:p>
+    <w:p>
+      <w:pPr>
+        <w:spacing w:before="40" w:after="80" w:line="300" w:lineRule="auto"/>
+      </w:pPr>
+      <w:r>
+        <w:rPr>
+          <w:rFonts w:ascii="Malgun Gothic" w:hAnsi="Malgun Gothic"/>
+          <w:color w:val="374151"/>
+          <w:sz w:val="20"/>
+        </w:rPr>
+        <w:t>Yes, it is formulated for all skin types.</w:t>
+      </w:r>
+    </w:p>
+    <w:p>
+      <w:pPr>
+        <w:spacing w:before="40" w:after="80" w:line="300" w:lineRule="auto"/>
+      </w:pPr>
+      <w:r>
+        <w:rPr>
+          <w:rFonts w:ascii="Malgun Gothic" w:hAnsi="Malgun Gothic"/>
+          <w:color w:val="374151"/>
+          <w:sz w:val="20"/>
+        </w:rPr>
+        <w:t>Despite the high 10% concentration of active Liftderm, the cream is carefully balanced with deeply moisturizing and soothing ingredients like Shea Butter, Allantoin, and Chamomile Flower Oil to ensure comfort.</w:t>
+      </w:r>
+    </w:p>
+    <w:p>
+      <w:pPr>
+        <w:spacing w:before="40" w:after="80" w:line="300" w:lineRule="auto"/>
+      </w:pPr>
+      <w:r>
+        <w:rPr>
+          <w:rFonts w:ascii="Malgun Gothic" w:hAnsi="Malgun Gothic"/>
+          <w:color w:val="374151"/>
+          <w:sz w:val="20"/>
+        </w:rPr>
+        <w:t>As with any active skincare, a patch test is recommended if you have hypersensitive skin.</w:t>
+      </w:r>
+    </w:p>
+    <w:p>
+      <w:pPr>
+        <w:spacing w:before="40" w:after="80" w:line="300" w:lineRule="auto"/>
+      </w:pPr>
+      <w:r>
+        <w:rPr>
+          <w:rFonts w:ascii="Malgun Gothic" w:hAnsi="Malgun Gothic"/>
+          <w:color w:val="374151"/>
+          <w:sz w:val="20"/>
+        </w:rPr>
+        <w:t>**Q4.</w:t>
+      </w:r>
+    </w:p>
+    <w:p>
+      <w:pPr>
+        <w:spacing w:before="40" w:after="80" w:line="300" w:lineRule="auto"/>
+      </w:pPr>
+      <w:r>
+        <w:rPr>
+          <w:rFonts w:ascii="Malgun Gothic" w:hAnsi="Malgun Gothic"/>
+          <w:color w:val="374151"/>
+          <w:sz w:val="20"/>
+        </w:rPr>
+        <w:t>[Active Ingredient Synergy]: How do the key active ingredients work together to smooth wrinkles and firm skin?</w:t>
+      </w:r>
+    </w:p>
+    <w:p>
+      <w:pPr>
+        <w:spacing w:before="40" w:after="80" w:line="300" w:lineRule="auto"/>
+      </w:pPr>
+      <w:r>
+        <w:rPr>
+          <w:rFonts w:ascii="Malgun Gothic" w:hAnsi="Malgun Gothic"/>
+          <w:color w:val="374151"/>
+          <w:sz w:val="20"/>
+        </w:rPr>
+        <w:t>**</w:t>
+      </w:r>
+    </w:p>
+    <w:p>
+      <w:pPr>
+        <w:spacing w:before="40" w:after="80" w:line="300" w:lineRule="auto"/>
+      </w:pPr>
+      <w:r>
+        <w:rPr>
+          <w:rFonts w:ascii="Malgun Gothic" w:hAnsi="Malgun Gothic"/>
+          <w:color w:val="374151"/>
+          <w:sz w:val="20"/>
+        </w:rPr>
+        <w:t>The potent 10% Liftderm complex works in synergy with Hexapeptide-2 and KFDA-approved Adenosine to stimulate skin elasticity and visibly smooth out wrinkles.</w:t>
+      </w:r>
+    </w:p>
+    <w:p>
+      <w:pPr>
+        <w:spacing w:before="40" w:after="80" w:line="300" w:lineRule="auto"/>
+      </w:pPr>
+      <w:r>
+        <w:rPr>
+          <w:rFonts w:ascii="Malgun Gothic" w:hAnsi="Malgun Gothic"/>
+          <w:color w:val="374151"/>
+          <w:sz w:val="20"/>
+        </w:rPr>
+        <w:t>Simultaneously, Hyaluronic Acid draws in moisture while Shea Butter and Beeswax create a protective barrier, plumping the skin from within to maintain a firm, smooth texture.</w:t>
+      </w:r>
+    </w:p>
+    <w:p>
+      <w:pPr>
+        <w:spacing w:before="40" w:after="80" w:line="300" w:lineRule="auto"/>
+      </w:pPr>
+      <w:r>
+        <w:rPr>
+          <w:rFonts w:ascii="Malgun Gothic" w:hAnsi="Malgun Gothic"/>
+          <w:color w:val="374151"/>
+          <w:sz w:val="20"/>
+        </w:rPr>
+        <w:t>**Q5.</w:t>
+      </w:r>
+    </w:p>
+    <w:p>
+      <w:pPr>
+        <w:spacing w:before="40" w:after="80" w:line="300" w:lineRule="auto"/>
+      </w:pPr>
+      <w:r>
+        <w:rPr>
+          <w:rFonts w:ascii="Malgun Gothic" w:hAnsi="Malgun Gothic"/>
+          <w:color w:val="374151"/>
+          <w:sz w:val="20"/>
+        </w:rPr>
+        <w:t>[Storage Precautions &amp; Customer Support]: How to store the product and official customer service contact (+82-2-6743-3206).</w:t>
+      </w:r>
+    </w:p>
+    <w:p>
+      <w:pPr>
+        <w:spacing w:before="40" w:after="80" w:line="300" w:lineRule="auto"/>
+      </w:pPr>
+      <w:r>
+        <w:rPr>
+          <w:rFonts w:ascii="Malgun Gothic" w:hAnsi="Malgun Gothic"/>
+          <w:color w:val="374151"/>
+          <w:sz w:val="20"/>
+        </w:rPr>
+        <w:t>**</w:t>
+      </w:r>
+    </w:p>
+    <w:p>
+      <w:pPr>
+        <w:spacing w:before="40" w:after="80" w:line="300" w:lineRule="auto"/>
+      </w:pPr>
+      <w:r>
+        <w:rPr>
+          <w:rFonts w:ascii="Malgun Gothic" w:hAnsi="Malgun Gothic"/>
+          <w:color w:val="374151"/>
+          <w:sz w:val="20"/>
+        </w:rPr>
+        <w:t>To maintain the efficacy of the active ingredients, store the product in a cool, dry place away from direct sunlight and out of reach of children.</w:t>
+      </w:r>
+    </w:p>
+    <w:p>
+      <w:pPr>
+        <w:spacing w:before="40" w:after="80" w:line="300" w:lineRule="auto"/>
+      </w:pPr>
+      <w:r>
+        <w:rPr>
+          <w:rFonts w:ascii="Malgun Gothic" w:hAnsi="Malgun Gothic"/>
+          <w:color w:val="374151"/>
+          <w:sz w:val="20"/>
+        </w:rPr>
+        <w:t>Always ensure the pump is clean after use.</w:t>
+      </w:r>
+    </w:p>
+    <w:p>
+      <w:pPr>
+        <w:spacing w:before="40" w:after="80" w:line="300" w:lineRule="auto"/>
+      </w:pPr>
+      <w:r>
+        <w:rPr>
+          <w:rFonts w:ascii="Malgun Gothic" w:hAnsi="Malgun Gothic"/>
+          <w:color w:val="374151"/>
+          <w:sz w:val="20"/>
+        </w:rPr>
+        <w:t>For any product inquiries, quality assurance, or support, please contact our official customer service at +82-2-6743-3206.</w:t>
       </w:r>
     </w:p>
     <w:sectPr>

</xml_diff>